<commit_message>
docs(I1): add preliminary core-experiment result to checkpoint note (review 'what we need')
The full review lists the checkpoint deliverable 'nominal-development
calibration with its support and an unscored inference pass'. The regenerated
note had the calibration tables but dropped the explicit unscored-inference-pass
+ per-stream convergence note the original carried. Restored in §2: nominal-dev
calibration with support (254 OPSSAT dev fragments; 319 P-1 / 176 C-1 cal points)
and an unscored inference pass (smoke test 11/11; R01 reference); no test scored,
no test metric, anomalous-class validation F1 not required. P-1 convergence slow
(val cal MSE ~1.38 -> ~0.36 over 30 epochs, 32 training windows); C-1 converges
(~0.81 -> ~0.09, early stopped). Updated in both docx and checkpoint_content.md.
</commit_message>
<xml_diff>
--- a/proposal/T05_I1_Checkpoint.docx
+++ b/proposal/T05_I1_Checkpoint.docx
@@ -2070,6 +2070,11 @@
       </w:r>
     </w:p>
     <w:p>
+      <w:r>
+        <w:t>Preliminary core-experiment result: the nominal-development calibration above (with its support — 254 OPSSAT-AD development fragments; 319 P-1 and 176 C-1 calibration points) and an unscored inference pass (scripts/smoke_test.py, 11/11 components pass; and the Week-1 reference run R01). No test partition is scored and no test metric is computed; anomalous-class validation F1 is not required. P-1 convergence is slow — validation (cal-point) reconstruction MSE falls from ~1.38 to ~0.36 over 30 epochs with only 32 training windows; C-1 converges from ~0.81 to ~0.09 (early stopped after no improvement for 5 epochs). Target point-F1 evaluation waits for the results freeze (20 November 2026).</w:t>
+      </w:r>
+    </w:p>
+    <w:p>
       <w:pPr>
         <w:pStyle w:val="Heading2"/>
       </w:pPr>

</xml_diff>